<commit_message>
Added a few handlers.  Renamed Memorize to Spell Action as it is a better fit.  Still trying to flesh out how Aggro is reported.
</commit_message>
<xml_diff>
--- a/Glass/Doc/Development Plan.docx
+++ b/Glass/Doc/Development Plan.docx
@@ -98,39 +98,7 @@
           <w:b/>
           <w:bCs/>
         </w:rPr>
-        <w:t xml:space="preserve">D2 — Perfect information. All environmental </w:t>
-      </w:r>
-      <w:proofErr w:type="gramStart"/>
-      <w:r>
-        <w:rPr>
-          <w:b/>
-          <w:bCs/>
-        </w:rPr>
-        <w:t>sensing</w:t>
-      </w:r>
-      <w:proofErr w:type="gramEnd"/>
-      <w:r>
-        <w:rPr>
-          <w:b/>
-          <w:bCs/>
-        </w:rPr>
-        <w:t xml:space="preserve"> arrives via network decode into shared state. Sensors do not delay or distort. A character never knows more than the coordinator. </w:t>
-      </w:r>
-      <w:proofErr w:type="spellStart"/>
-      <w:r>
-        <w:rPr>
-          <w:b/>
-          <w:bCs/>
-        </w:rPr>
-        <w:t>ISXGlass</w:t>
-      </w:r>
-      <w:proofErr w:type="spellEnd"/>
-      <w:r>
-        <w:rPr>
-          <w:b/>
-          <w:bCs/>
-        </w:rPr>
-        <w:t xml:space="preserve"> provides no sensing — it is a command sink only.</w:t>
+        <w:t>D2 — Perfect information. All environmental sensing arrives via network decode into shared state. Sensors do not delay or distort. A character never knows more than the coordinator. ISXGlass provides no sensing — it is a command sink only.</w:t>
       </w:r>
     </w:p>
     <w:p>
@@ -160,101 +128,37 @@
           <w:b/>
           <w:bCs/>
         </w:rPr>
-        <w:t xml:space="preserve">D4 — The chat channel </w:t>
-      </w:r>
-      <w:proofErr w:type="gramStart"/>
-      <w:r>
-        <w:rPr>
-          <w:b/>
-          <w:bCs/>
-        </w:rPr>
-        <w:t>is</w:t>
-      </w:r>
-      <w:proofErr w:type="gramEnd"/>
-      <w:r>
-        <w:rPr>
-          <w:b/>
-          <w:bCs/>
-        </w:rPr>
-        <w:t xml:space="preserve"> the operator interface, both directions. Inbound: the MA's chat ("assist me on a skeleton", "</w:t>
-      </w:r>
-      <w:proofErr w:type="spellStart"/>
-      <w:r>
-        <w:rPr>
-          <w:b/>
-          <w:bCs/>
-        </w:rPr>
-        <w:t>mez</w:t>
-      </w:r>
-      <w:proofErr w:type="spellEnd"/>
-      <w:r>
-        <w:rPr>
-          <w:b/>
-          <w:bCs/>
-        </w:rPr>
-        <w:t xml:space="preserve"> that") is decoded off the wire like any packet and drives coordinator behavior. Outbound: coordinators report status by speaking through a character's session ("Healer needs 30s"). No new operator UI is required for basic automation.</w:t>
-      </w:r>
-    </w:p>
-    <w:p>
-      <w:pPr>
-        <w:rPr>
-          <w:b/>
-          <w:bCs/>
-        </w:rPr>
-      </w:pPr>
-      <w:r>
-        <w:rPr>
-          <w:b/>
-          <w:bCs/>
-        </w:rPr>
-        <w:t xml:space="preserve">D5 — Capabilities are derived, not authored. Class and level from </w:t>
-      </w:r>
-      <w:proofErr w:type="spellStart"/>
-      <w:r>
-        <w:rPr>
-          <w:b/>
-          <w:bCs/>
-        </w:rPr>
-        <w:t>CharacterRepository</w:t>
-      </w:r>
-      <w:proofErr w:type="spellEnd"/>
-      <w:r>
-        <w:rPr>
-          <w:b/>
-          <w:bCs/>
-        </w:rPr>
-        <w:t xml:space="preserve"> determine role capability (a L65 Cleric is a healer). Current loadout should come from the wire (see I-1). Static reference data is created only when a use case consumes it.</w:t>
-      </w:r>
-    </w:p>
-    <w:p>
-      <w:pPr>
-        <w:rPr>
-          <w:b/>
-          <w:bCs/>
-        </w:rPr>
-      </w:pPr>
-      <w:r>
-        <w:rPr>
-          <w:b/>
-          <w:bCs/>
-        </w:rPr>
-        <w:t>D6 — Contingencies are pre-planned. For known failure events (</w:t>
-      </w:r>
-      <w:proofErr w:type="spellStart"/>
-      <w:r>
-        <w:rPr>
-          <w:b/>
-          <w:bCs/>
-        </w:rPr>
-        <w:t>mez</w:t>
-      </w:r>
-      <w:proofErr w:type="spellEnd"/>
-      <w:r>
-        <w:rPr>
-          <w:b/>
-          <w:bCs/>
-        </w:rPr>
-        <w:t xml:space="preserve"> break, charm break), the coordinator computes the reaction bundle at fight start — who stuns, who heals, who taunts — and fires it on the event. No fresh decisions under pressure.</w:t>
+        <w:t>D4 — The chat channel is the operator interface, both directions. Inbound: the MA's chat ("assist me on a skeleton", "mez that") is decoded off the wire like any packet and drives coordinator behavior. Outbound: coordinators report status by speaking through a character's session ("Healer needs 30s"). No new operator UI is required for basic automation.</w:t>
+      </w:r>
+    </w:p>
+    <w:p>
+      <w:pPr>
+        <w:rPr>
+          <w:b/>
+          <w:bCs/>
+        </w:rPr>
+      </w:pPr>
+      <w:r>
+        <w:rPr>
+          <w:b/>
+          <w:bCs/>
+        </w:rPr>
+        <w:t>D5 — Capabilities are derived, not authored. Class and level from CharacterRepository determine role capability (a L65 Cleric is a healer). Current loadout should come from the wire (see I-1). Static reference data is created only when a use case consumes it.</w:t>
+      </w:r>
+    </w:p>
+    <w:p>
+      <w:pPr>
+        <w:rPr>
+          <w:b/>
+          <w:bCs/>
+        </w:rPr>
+      </w:pPr>
+      <w:r>
+        <w:rPr>
+          <w:b/>
+          <w:bCs/>
+        </w:rPr>
+        <w:t>D6 — Contingencies are pre-planned. For known failure events (mez break, charm break), the coordinator computes the reaction bundle at fight start — who stuns, who heals, who taunts — and fires it on the event. No fresh decisions under pressure.</w:t>
       </w:r>
     </w:p>
     <w:p>
@@ -270,39 +174,7 @@
           <w:bCs/>
         </w:rPr>
         <w:lastRenderedPageBreak/>
-        <w:t xml:space="preserve">D7 — Deferred: multi-coordinator arbitration. When two coordinators address one character (heal vs. move), something must arbitrate. Deliberately unresolved. Trigger to revisit: the second concurrent coordinator comes online — concretely, the </w:t>
-      </w:r>
-      <w:proofErr w:type="spellStart"/>
-      <w:r>
-        <w:rPr>
-          <w:b/>
-          <w:bCs/>
-        </w:rPr>
-        <w:t>mez</w:t>
-      </w:r>
-      <w:proofErr w:type="spellEnd"/>
-      <w:r>
-        <w:rPr>
-          <w:b/>
-          <w:bCs/>
-        </w:rPr>
-        <w:t xml:space="preserve">-break contingency (UC-10), </w:t>
-      </w:r>
-      <w:proofErr w:type="gramStart"/>
-      <w:r>
-        <w:rPr>
-          <w:b/>
-          <w:bCs/>
-        </w:rPr>
-        <w:t>where</w:t>
-      </w:r>
-      <w:proofErr w:type="gramEnd"/>
-      <w:r>
-        <w:rPr>
-          <w:b/>
-          <w:bCs/>
-        </w:rPr>
-        <w:t xml:space="preserve"> CC and healing act together.</w:t>
+        <w:t>D7 — Deferred: multi-coordinator arbitration. When two coordinators address one character (heal vs. move), something must arbitrate. Deliberately unresolved. Trigger to revisit: the second concurrent coordinator comes online — concretely, the mez-break contingency (UC-10), where CC and healing act together.</w:t>
       </w:r>
     </w:p>
     <w:p>
@@ -333,23 +205,7 @@
           <w:b/>
           <w:bCs/>
         </w:rPr>
-        <w:t xml:space="preserve">UC-1 — Reactive </w:t>
-      </w:r>
-      <w:proofErr w:type="gramStart"/>
-      <w:r>
-        <w:rPr>
-          <w:b/>
-          <w:bCs/>
-        </w:rPr>
-        <w:t>single</w:t>
-      </w:r>
-      <w:proofErr w:type="gramEnd"/>
-      <w:r>
-        <w:rPr>
-          <w:b/>
-          <w:bCs/>
-        </w:rPr>
-        <w:t xml:space="preserve"> heal. Group member drops below threshold; coordinator selects a healer and heal; healer casts on them. Core of Demo 2. Only unproven prerequisite: the dispatch path (P-1).</w:t>
+        <w:t>UC-1 — Reactive single heal. Group member drops below threshold; coordinator selects a healer and heal; healer casts on them. Core of Demo 2. Only unproven prerequisite: the dispatch path (P-1).</w:t>
       </w:r>
     </w:p>
     <w:p>
@@ -379,133 +235,37 @@
           <w:b/>
           <w:bCs/>
         </w:rPr>
-        <w:t xml:space="preserve">UC-3 — No wasted </w:t>
-      </w:r>
-      <w:proofErr w:type="gramStart"/>
-      <w:r>
-        <w:rPr>
-          <w:b/>
-          <w:bCs/>
-        </w:rPr>
-        <w:t>casts</w:t>
-      </w:r>
-      <w:proofErr w:type="gramEnd"/>
-      <w:r>
-        <w:rPr>
-          <w:b/>
-          <w:bCs/>
-        </w:rPr>
-        <w:t>. Respect the healer's cast-in-progress state, mana, and target's projected HP at land time. Decode exists (</w:t>
-      </w:r>
-      <w:proofErr w:type="spellStart"/>
-      <w:r>
-        <w:rPr>
-          <w:b/>
-          <w:bCs/>
-        </w:rPr>
-        <w:t>StartCast</w:t>
-      </w:r>
-      <w:proofErr w:type="spellEnd"/>
-      <w:r>
-        <w:rPr>
-          <w:b/>
-          <w:bCs/>
-        </w:rPr>
-        <w:t xml:space="preserve">, </w:t>
-      </w:r>
-      <w:proofErr w:type="spellStart"/>
-      <w:r>
-        <w:rPr>
-          <w:b/>
-          <w:bCs/>
-        </w:rPr>
-        <w:t>CastResolution</w:t>
-      </w:r>
-      <w:proofErr w:type="spellEnd"/>
-      <w:r>
-        <w:rPr>
-          <w:b/>
-          <w:bCs/>
-        </w:rPr>
-        <w:t xml:space="preserve">, </w:t>
-      </w:r>
-      <w:proofErr w:type="spellStart"/>
-      <w:r>
-        <w:rPr>
-          <w:b/>
-          <w:bCs/>
-        </w:rPr>
-        <w:t>ManaUpdate</w:t>
-      </w:r>
-      <w:proofErr w:type="spellEnd"/>
-      <w:r>
-        <w:rPr>
-          <w:b/>
-          <w:bCs/>
-        </w:rPr>
-        <w:t>).</w:t>
-      </w:r>
-    </w:p>
-    <w:p>
-      <w:pPr>
-        <w:rPr>
-          <w:b/>
-          <w:bCs/>
-        </w:rPr>
-      </w:pPr>
-      <w:r>
-        <w:rPr>
-          <w:b/>
-          <w:bCs/>
-        </w:rPr>
-        <w:t xml:space="preserve">UC-4 — Danger prediction. HP rate-of-change derived from successive updates; a fast-dropping tank at 85% outranks a parked caster at 60%. First derived-state implementation; also feeds </w:t>
-      </w:r>
-      <w:proofErr w:type="spellStart"/>
-      <w:r>
-        <w:rPr>
-          <w:b/>
-          <w:bCs/>
-        </w:rPr>
-        <w:t>overheal</w:t>
-      </w:r>
-      <w:proofErr w:type="spellEnd"/>
-      <w:r>
-        <w:rPr>
-          <w:b/>
-          <w:bCs/>
-        </w:rPr>
-        <w:t xml:space="preserve"> avoidance.</w:t>
-      </w:r>
-    </w:p>
-    <w:p>
-      <w:pPr>
-        <w:rPr>
-          <w:b/>
-          <w:bCs/>
-        </w:rPr>
-      </w:pPr>
-      <w:r>
-        <w:rPr>
-          <w:b/>
-          <w:bCs/>
-        </w:rPr>
-        <w:t xml:space="preserve">UC-5 — Cure dispatch. </w:t>
-      </w:r>
-      <w:proofErr w:type="spellStart"/>
-      <w:r>
-        <w:rPr>
-          <w:b/>
-          <w:bCs/>
-        </w:rPr>
-        <w:t>Debuff→cure</w:t>
-      </w:r>
-      <w:proofErr w:type="spellEnd"/>
-      <w:r>
-        <w:rPr>
-          <w:b/>
-          <w:bCs/>
-        </w:rPr>
-        <w:t xml:space="preserve"> mapping, dispatched to the afflicted. Blocked on decode coverage (I-3). Later phase.</w:t>
+        <w:t>UC-3 — No wasted casts. Respect the healer's cast-in-progress state, mana, and target's projected HP at land time. Decode exists (StartCast, CastResolution, ManaUpdate).</w:t>
+      </w:r>
+    </w:p>
+    <w:p>
+      <w:pPr>
+        <w:rPr>
+          <w:b/>
+          <w:bCs/>
+        </w:rPr>
+      </w:pPr>
+      <w:r>
+        <w:rPr>
+          <w:b/>
+          <w:bCs/>
+        </w:rPr>
+        <w:t>UC-4 — Danger prediction. HP rate-of-change derived from successive updates; a fast-dropping tank at 85% outranks a parked caster at 60%. First derived-state implementation; also feeds overheal avoidance.</w:t>
+      </w:r>
+    </w:p>
+    <w:p>
+      <w:pPr>
+        <w:rPr>
+          <w:b/>
+          <w:bCs/>
+        </w:rPr>
+      </w:pPr>
+      <w:r>
+        <w:rPr>
+          <w:b/>
+          <w:bCs/>
+        </w:rPr>
+        <w:t>UC-5 — Cure dispatch. Debuff→cure mapping, dispatched to the afflicted. Blocked on decode coverage (I-3). Later phase.</w:t>
       </w:r>
     </w:p>
     <w:p>
@@ -528,102 +288,22 @@
           <w:b/>
           <w:bCs/>
         </w:rPr>
-        <w:t xml:space="preserve">UC-6 — MA-directed </w:t>
-      </w:r>
-      <w:proofErr w:type="gramStart"/>
-      <w:r>
-        <w:rPr>
-          <w:b/>
-          <w:bCs/>
-        </w:rPr>
-        <w:t>engage</w:t>
-      </w:r>
-      <w:proofErr w:type="gramEnd"/>
-      <w:r>
-        <w:rPr>
-          <w:b/>
-          <w:bCs/>
-        </w:rPr>
-        <w:t xml:space="preserve">. Two-phase: on a target entering camp, characters /assist &lt;MA&gt; immediately (acquisition is always safe); engagement only on the MA's decoded chat signal. Engage behavior is per-role: melee attack; healers target friendlies; casters per UC-7. No spawn-ID targeting </w:t>
-      </w:r>
-      <w:proofErr w:type="gramStart"/>
-      <w:r>
-        <w:rPr>
-          <w:b/>
-          <w:bCs/>
-        </w:rPr>
-        <w:t>needed — /</w:t>
-      </w:r>
-      <w:proofErr w:type="gramEnd"/>
-      <w:r>
-        <w:rPr>
-          <w:b/>
-          <w:bCs/>
-        </w:rPr>
-        <w:t>assist by name is the mechanism.</w:t>
-      </w:r>
-    </w:p>
-    <w:p>
-      <w:pPr>
-        <w:rPr>
-          <w:b/>
-          <w:bCs/>
-        </w:rPr>
-      </w:pPr>
-      <w:r>
-        <w:rPr>
-          <w:b/>
-          <w:bCs/>
-        </w:rPr>
-        <w:t xml:space="preserve">UC-7 — Caster DPS with </w:t>
-      </w:r>
-      <w:proofErr w:type="spellStart"/>
-      <w:r>
-        <w:rPr>
-          <w:b/>
-          <w:bCs/>
-        </w:rPr>
-        <w:t>aggro</w:t>
-      </w:r>
-      <w:proofErr w:type="spellEnd"/>
-      <w:r>
-        <w:rPr>
-          <w:b/>
-          <w:bCs/>
-        </w:rPr>
-        <w:t xml:space="preserve"> discipline. Cast only with </w:t>
-      </w:r>
-      <w:proofErr w:type="spellStart"/>
-      <w:r>
-        <w:rPr>
-          <w:b/>
-          <w:bCs/>
-        </w:rPr>
-        <w:t>aggro</w:t>
-      </w:r>
-      <w:proofErr w:type="spellEnd"/>
-      <w:r>
-        <w:rPr>
-          <w:b/>
-          <w:bCs/>
-        </w:rPr>
-        <w:t xml:space="preserve"> headroom (see I-2); DOTs for hybrids (necro/druid/shaman), nukes for pure casters; a </w:t>
-      </w:r>
-      <w:proofErr w:type="spellStart"/>
-      <w:r>
-        <w:rPr>
-          <w:b/>
-          <w:bCs/>
-        </w:rPr>
-        <w:t>mana</w:t>
-      </w:r>
-      <w:proofErr w:type="spellEnd"/>
-      <w:r>
-        <w:rPr>
-          <w:b/>
-          <w:bCs/>
-        </w:rPr>
-        <w:t xml:space="preserve"> floor reserved for the character's primary job. Applies to healers too: opportunistic DPS is welcome only when it cannot compromise healing.</w:t>
+        <w:t>UC-6 — MA-directed engage. Two-phase: on a target entering camp, characters /assist &lt;MA&gt; immediately (acquisition is always safe); engagement only on the MA's decoded chat signal. Engage behavior is per-role: melee attack; healers target friendlies; casters per UC-7. No spawn-ID targeting needed — /assist by name is the mechanism.</w:t>
+      </w:r>
+    </w:p>
+    <w:p>
+      <w:pPr>
+        <w:rPr>
+          <w:b/>
+          <w:bCs/>
+        </w:rPr>
+      </w:pPr>
+      <w:r>
+        <w:rPr>
+          <w:b/>
+          <w:bCs/>
+        </w:rPr>
+        <w:t>UC-7 — Caster DPS with aggro discipline. Cast only with aggro headroom (see I-2); DOTs for hybrids (necro/druid/shaman), nukes for pure casters; a mana floor reserved for the character's primary job. Applies to healers too: opportunistic DPS is welcome only when it cannot compromise healing.</w:t>
       </w:r>
     </w:p>
     <w:p>
@@ -655,134 +335,22 @@
           <w:bCs/>
         </w:rPr>
         <w:lastRenderedPageBreak/>
-        <w:t>UC-8 — MA verbal fight direction. "</w:t>
-      </w:r>
-      <w:proofErr w:type="spellStart"/>
-      <w:r>
-        <w:rPr>
-          <w:b/>
-          <w:bCs/>
-        </w:rPr>
-        <w:t>Offtank</w:t>
-      </w:r>
-      <w:proofErr w:type="spellEnd"/>
-      <w:r>
-        <w:rPr>
-          <w:b/>
-          <w:bCs/>
-        </w:rPr>
-        <w:t xml:space="preserve"> that", "</w:t>
-      </w:r>
-      <w:proofErr w:type="spellStart"/>
-      <w:r>
-        <w:rPr>
-          <w:b/>
-          <w:bCs/>
-        </w:rPr>
-        <w:t>mez</w:t>
-      </w:r>
-      <w:proofErr w:type="spellEnd"/>
-      <w:r>
-        <w:rPr>
-          <w:b/>
-          <w:bCs/>
-        </w:rPr>
-        <w:t xml:space="preserve"> that", "switch </w:t>
-      </w:r>
-      <w:proofErr w:type="gramStart"/>
-      <w:r>
-        <w:rPr>
-          <w:b/>
-          <w:bCs/>
-        </w:rPr>
-        <w:t>targets" —</w:t>
-      </w:r>
-      <w:proofErr w:type="gramEnd"/>
-      <w:r>
-        <w:rPr>
-          <w:b/>
-          <w:bCs/>
-        </w:rPr>
-        <w:t xml:space="preserve"> decoded directives translated into allocations. Introduces per-target effect tracking: </w:t>
-      </w:r>
-      <w:proofErr w:type="spellStart"/>
-      <w:r>
-        <w:rPr>
-          <w:b/>
-          <w:bCs/>
-        </w:rPr>
-        <w:t>DOTted</w:t>
-      </w:r>
-      <w:proofErr w:type="spellEnd"/>
-      <w:r>
-        <w:rPr>
-          <w:b/>
-          <w:bCs/>
-        </w:rPr>
-        <w:t xml:space="preserve"> targets cannot be </w:t>
-      </w:r>
-      <w:proofErr w:type="spellStart"/>
-      <w:r>
-        <w:rPr>
-          <w:b/>
-          <w:bCs/>
-        </w:rPr>
-        <w:t>mezzed</w:t>
-      </w:r>
-      <w:proofErr w:type="spellEnd"/>
-      <w:r>
-        <w:rPr>
-          <w:b/>
-          <w:bCs/>
-        </w:rPr>
-        <w:t xml:space="preserve"> until DOTs fade; damaging a </w:t>
-      </w:r>
-      <w:proofErr w:type="spellStart"/>
-      <w:r>
-        <w:rPr>
-          <w:b/>
-          <w:bCs/>
-        </w:rPr>
-        <w:t>mezzed</w:t>
-      </w:r>
-      <w:proofErr w:type="spellEnd"/>
-      <w:r>
-        <w:rPr>
-          <w:b/>
-          <w:bCs/>
-        </w:rPr>
-        <w:t xml:space="preserve"> target is forbidden.</w:t>
-      </w:r>
-    </w:p>
-    <w:p>
-      <w:pPr>
-        <w:rPr>
-          <w:b/>
-          <w:bCs/>
-        </w:rPr>
-      </w:pPr>
-      <w:r>
-        <w:rPr>
-          <w:b/>
-          <w:bCs/>
-        </w:rPr>
-        <w:t xml:space="preserve">UC-9 — Between-fight sustainment. Post-kill: return to positions, sit/med, rebuff window. Coordinator assesses readiness; if the healer needs time, it says so via chat (D4). </w:t>
-      </w:r>
-      <w:proofErr w:type="spellStart"/>
-      <w:r>
-        <w:rPr>
-          <w:b/>
-          <w:bCs/>
-        </w:rPr>
-        <w:t>Idle→ready→engaged</w:t>
-      </w:r>
-      <w:proofErr w:type="spellEnd"/>
-      <w:r>
-        <w:rPr>
-          <w:b/>
-          <w:bCs/>
-        </w:rPr>
-        <w:t xml:space="preserve"> state cycle in miniature.</w:t>
+        <w:t>UC-8 — MA verbal fight direction. "Offtank that", "mez that", "switch targets" — decoded directives translated into allocations. Introduces per-target effect tracking: DOTted targets cannot be mezzed until DOTs fade; damaging a mezzed target is forbidden.</w:t>
+      </w:r>
+    </w:p>
+    <w:p>
+      <w:pPr>
+        <w:rPr>
+          <w:b/>
+          <w:bCs/>
+        </w:rPr>
+      </w:pPr>
+      <w:r>
+        <w:rPr>
+          <w:b/>
+          <w:bCs/>
+        </w:rPr>
+        <w:t>UC-9 — Between-fight sustainment. Post-kill: return to positions, sit/med, rebuff window. Coordinator assesses readiness; if the healer needs time, it says so via chat (D4). Idle→ready→engaged state cycle in miniature.</w:t>
       </w:r>
     </w:p>
     <w:p>
@@ -805,71 +373,7 @@
           <w:b/>
           <w:bCs/>
         </w:rPr>
-        <w:t xml:space="preserve">UC-10 — Mez and charm management. Coordinator tracks </w:t>
-      </w:r>
-      <w:proofErr w:type="spellStart"/>
-      <w:r>
-        <w:rPr>
-          <w:b/>
-          <w:bCs/>
-        </w:rPr>
-        <w:t>mezzed</w:t>
-      </w:r>
-      <w:proofErr w:type="spellEnd"/>
-      <w:r>
-        <w:rPr>
-          <w:b/>
-          <w:bCs/>
-        </w:rPr>
-        <w:t xml:space="preserve"> targets and durations (REF spell data), schedules </w:t>
-      </w:r>
-      <w:proofErr w:type="spellStart"/>
-      <w:r>
-        <w:rPr>
-          <w:b/>
-          <w:bCs/>
-        </w:rPr>
-        <w:t>remezzes</w:t>
-      </w:r>
-      <w:proofErr w:type="spellEnd"/>
-      <w:r>
-        <w:rPr>
-          <w:b/>
-          <w:bCs/>
-        </w:rPr>
-        <w:t xml:space="preserve"> with fast reacquisition, and detects early breaks from the wire. Pre-planned break contingency (D6): stun → </w:t>
-      </w:r>
-      <w:proofErr w:type="spellStart"/>
-      <w:r>
-        <w:rPr>
-          <w:b/>
-          <w:bCs/>
-        </w:rPr>
-        <w:t>remez</w:t>
-      </w:r>
-      <w:proofErr w:type="spellEnd"/>
-      <w:r>
-        <w:rPr>
-          <w:b/>
-          <w:bCs/>
-        </w:rPr>
-        <w:t>, emergency heal staged on the enchanter, tank snap-</w:t>
-      </w:r>
-      <w:proofErr w:type="spellStart"/>
-      <w:r>
-        <w:rPr>
-          <w:b/>
-          <w:bCs/>
-        </w:rPr>
-        <w:t>aggro</w:t>
-      </w:r>
-      <w:proofErr w:type="spellEnd"/>
-      <w:r>
-        <w:rPr>
-          <w:b/>
-          <w:bCs/>
-        </w:rPr>
-        <w:t xml:space="preserve"> fallback. Charm is the same machinery at higher stakes — the charmed mob is an asset until break, then an immediate threat. First cross-coordinator case (see D7).</w:t>
+        <w:t>UC-10 — Mez and charm management. Coordinator tracks mezzed targets and durations (REF spell data), schedules remezzes with fast reacquisition, and detects early breaks from the wire. Pre-planned break contingency (D6): stun → remez, emergency heal staged on the enchanter, tank snap-aggro fallback. Charm is the same machinery at higher stakes — the charmed mob is an asset until break, then an immediate threat. First cross-coordinator case (see D7).</w:t>
       </w:r>
     </w:p>
     <w:p>
@@ -932,21 +436,12 @@
           <w:bCs/>
         </w:rPr>
       </w:pPr>
-      <w:proofErr w:type="spellStart"/>
-      <w:r>
-        <w:rPr>
-          <w:b/>
-          <w:bCs/>
-        </w:rPr>
-        <w:t>Overheal</w:t>
-      </w:r>
-      <w:proofErr w:type="spellEnd"/>
-      <w:r>
-        <w:rPr>
-          <w:b/>
-          <w:bCs/>
-        </w:rPr>
-        <w:t xml:space="preserve"> avoidance: choose heal size against the deficit; never heal past 100%.</w:t>
+      <w:r>
+        <w:rPr>
+          <w:b/>
+          <w:bCs/>
+        </w:rPr>
+        <w:t>Overheal avoidance: choose heal size against the deficit; never heal past 100%.</w:t>
       </w:r>
     </w:p>
     <w:p>
@@ -1030,6 +525,14 @@
         </w:rPr>
         <w:t>I-1: Does the player profile packet carry the spellbook and memorized gems? Determines whether the capability model knows a healer's loadout. If absent, identify an alternative (observed casts imply memorized).</w:t>
       </w:r>
+      <w:r>
+        <w:rPr>
+          <w:b/>
+          <w:bCs/>
+        </w:rPr>
+        <w:br/>
+        <w:t>[1-August completed, but data not stored in repo yet]</w:t>
+      </w:r>
     </w:p>
     <w:p>
       <w:pPr>
@@ -1047,71 +550,7 @@
           <w:b/>
           <w:bCs/>
         </w:rPr>
-        <w:t xml:space="preserve">I-2: The client displays an </w:t>
-      </w:r>
-      <w:proofErr w:type="spellStart"/>
-      <w:r>
-        <w:rPr>
-          <w:b/>
-          <w:bCs/>
-        </w:rPr>
-        <w:t>aggro</w:t>
-      </w:r>
-      <w:proofErr w:type="spellEnd"/>
-      <w:r>
-        <w:rPr>
-          <w:b/>
-          <w:bCs/>
-        </w:rPr>
-        <w:t xml:space="preserve"> meter, so </w:t>
-      </w:r>
-      <w:proofErr w:type="spellStart"/>
-      <w:r>
-        <w:rPr>
-          <w:b/>
-          <w:bCs/>
-        </w:rPr>
-        <w:t>aggro</w:t>
-      </w:r>
-      <w:proofErr w:type="spellEnd"/>
-      <w:r>
-        <w:rPr>
-          <w:b/>
-          <w:bCs/>
-        </w:rPr>
-        <w:t xml:space="preserve"> data is on the wire. Locate and decode it. This is </w:t>
-      </w:r>
-      <w:proofErr w:type="gramStart"/>
-      <w:r>
-        <w:rPr>
-          <w:b/>
-          <w:bCs/>
-        </w:rPr>
-        <w:t>the use</w:t>
-      </w:r>
-      <w:proofErr w:type="gramEnd"/>
-      <w:r>
-        <w:rPr>
-          <w:b/>
-          <w:bCs/>
-        </w:rPr>
-        <w:t xml:space="preserve"> case that justifies </w:t>
-      </w:r>
-      <w:proofErr w:type="spellStart"/>
-      <w:r>
-        <w:rPr>
-          <w:b/>
-          <w:bCs/>
-        </w:rPr>
-        <w:t>AggroInference</w:t>
-      </w:r>
-      <w:proofErr w:type="spellEnd"/>
-      <w:r>
-        <w:rPr>
-          <w:b/>
-          <w:bCs/>
-        </w:rPr>
-        <w:t>.</w:t>
+        <w:t>I-2: The client displays an aggro meter, so aggro data is on the wire. Locate and decode it. This is the use case that justifies AggroInference.</w:t>
       </w:r>
     </w:p>
     <w:p>
@@ -1130,71 +569,22 @@
           <w:b/>
           <w:bCs/>
         </w:rPr>
-        <w:t>I-3: What do the chat-message handlers (</w:t>
-      </w:r>
-      <w:proofErr w:type="spellStart"/>
-      <w:r>
-        <w:rPr>
-          <w:b/>
-          <w:bCs/>
-        </w:rPr>
-        <w:t>HandleCommonMessage</w:t>
-      </w:r>
-      <w:proofErr w:type="spellEnd"/>
-      <w:r>
-        <w:rPr>
-          <w:b/>
-          <w:bCs/>
-        </w:rPr>
-        <w:t xml:space="preserve"> / </w:t>
-      </w:r>
-      <w:proofErr w:type="spellStart"/>
-      <w:r>
-        <w:rPr>
-          <w:b/>
-          <w:bCs/>
-        </w:rPr>
-        <w:t>HandleSimpleMessage</w:t>
-      </w:r>
-      <w:proofErr w:type="spellEnd"/>
-      <w:r>
-        <w:rPr>
-          <w:b/>
-          <w:bCs/>
-        </w:rPr>
-        <w:t xml:space="preserve"> / channel messages) </w:t>
-      </w:r>
-      <w:proofErr w:type="gramStart"/>
-      <w:r>
-        <w:rPr>
-          <w:b/>
-          <w:bCs/>
-        </w:rPr>
-        <w:t>actually yield</w:t>
-      </w:r>
-      <w:proofErr w:type="gramEnd"/>
-      <w:r>
-        <w:rPr>
-          <w:b/>
-          <w:bCs/>
-        </w:rPr>
-        <w:t xml:space="preserve">? D4 depends on </w:t>
-      </w:r>
-      <w:proofErr w:type="gramStart"/>
-      <w:r>
-        <w:rPr>
-          <w:b/>
-          <w:bCs/>
-        </w:rPr>
-        <w:t>reliable decoded</w:t>
-      </w:r>
-      <w:proofErr w:type="gramEnd"/>
-      <w:r>
-        <w:rPr>
-          <w:b/>
-          <w:bCs/>
-        </w:rPr>
-        <w:t xml:space="preserve"> chat with speaker and channel.</w:t>
+        <w:t>I-3: What do the chat-message handlers (HandleCommonMessage / HandleSimpleMessage / channel messages) actually yield? D4 depends on reliable decoded chat with speaker and channel.</w:t>
+      </w:r>
+      <w:r>
+        <w:rPr>
+          <w:b/>
+          <w:bCs/>
+        </w:rPr>
+        <w:br/>
+      </w:r>
+      <w:r>
+        <w:rPr>
+          <w:b/>
+          <w:bCs/>
+        </w:rPr>
+        <w:br/>
+        <w:t>[Really a non-issue]</w:t>
       </w:r>
     </w:p>
     <w:p>
@@ -1213,23 +603,7 @@
           <w:b/>
           <w:bCs/>
         </w:rPr>
-        <w:t xml:space="preserve">I-4: Spell gem readiness — </w:t>
-      </w:r>
-      <w:proofErr w:type="spellStart"/>
-      <w:r>
-        <w:rPr>
-          <w:b/>
-          <w:bCs/>
-        </w:rPr>
-        <w:t>modelable</w:t>
-      </w:r>
-      <w:proofErr w:type="spellEnd"/>
-      <w:r>
-        <w:rPr>
-          <w:b/>
-          <w:bCs/>
-        </w:rPr>
-        <w:t xml:space="preserve"> from observed casts + static recast data; confirm no wire source exists.</w:t>
+        <w:t>I-4: Spell gem readiness — modelable from observed casts + static recast data; confirm no wire source exists.</w:t>
       </w:r>
     </w:p>
     <w:p>
@@ -1248,42 +622,7 @@
           <w:b/>
           <w:bCs/>
         </w:rPr>
-        <w:t xml:space="preserve">I-5: Debuff application/fade decode coverage beyond </w:t>
-      </w:r>
-      <w:proofErr w:type="spellStart"/>
-      <w:r>
-        <w:rPr>
-          <w:b/>
-          <w:bCs/>
-        </w:rPr>
-        <w:t>HandleBuffTimers</w:t>
-      </w:r>
-      <w:proofErr w:type="spellEnd"/>
-      <w:r>
-        <w:rPr>
-          <w:b/>
-          <w:bCs/>
-        </w:rPr>
-        <w:t xml:space="preserve"> (blocks UC-5).</w:t>
-      </w:r>
-    </w:p>
-    <w:p>
-      <w:pPr>
-        <w:numPr>
-          <w:ilvl w:val="0"/>
-          <w:numId w:val="1"/>
-        </w:numPr>
-        <w:rPr>
-          <w:b/>
-          <w:bCs/>
-        </w:rPr>
-      </w:pPr>
-      <w:r>
-        <w:rPr>
-          <w:b/>
-          <w:bCs/>
-        </w:rPr>
-        <w:t>I-6: Outbound chat — confirm the command pipe can drive a chat message from a session (D4 outbound).</w:t>
+        <w:t>I-5: Debuff application/fade decode coverage beyond HandleBuffTimers (blocks UC-5).</w:t>
       </w:r>
     </w:p>
     <w:p>
@@ -1452,23 +791,7 @@
           <w:b/>
           <w:bCs/>
         </w:rPr>
-        <w:t xml:space="preserve">P-4: Demo 1 — UC-6. Multi-agent </w:t>
-      </w:r>
-      <w:proofErr w:type="gramStart"/>
-      <w:r>
-        <w:rPr>
-          <w:b/>
-          <w:bCs/>
-        </w:rPr>
-        <w:t>assist</w:t>
-      </w:r>
-      <w:proofErr w:type="gramEnd"/>
-      <w:r>
-        <w:rPr>
-          <w:b/>
-          <w:bCs/>
-        </w:rPr>
-        <w:t xml:space="preserve"> under MA chat direction. Requires I-3.</w:t>
+        <w:t>P-4: Demo 1 — UC-6. Multi-agent assist under MA chat direction. Requires I-3.</w:t>
       </w:r>
     </w:p>
     <w:p>
@@ -1487,23 +810,7 @@
           <w:b/>
           <w:bCs/>
         </w:rPr>
-        <w:t xml:space="preserve">P-5: UC-9, UC-7. Sustainment, then caster participation (I-2 for </w:t>
-      </w:r>
-      <w:proofErr w:type="spellStart"/>
-      <w:r>
-        <w:rPr>
-          <w:b/>
-          <w:bCs/>
-        </w:rPr>
-        <w:t>aggro</w:t>
-      </w:r>
-      <w:proofErr w:type="spellEnd"/>
-      <w:r>
-        <w:rPr>
-          <w:b/>
-          <w:bCs/>
-        </w:rPr>
-        <w:t>).</w:t>
+        <w:t>P-5: UC-9, UC-7. Sustainment, then caster participation (I-2 for aggro).</w:t>
       </w:r>
     </w:p>
     <w:p>
@@ -2622,6 +1929,7 @@
   <w:style w:type="character" w:default="1" w:styleId="DefaultParagraphFont">
     <w:name w:val="Default Paragraph Font"/>
     <w:uiPriority w:val="1"/>
+    <w:semiHidden/>
     <w:unhideWhenUsed/>
   </w:style>
   <w:style w:type="table" w:default="1" w:styleId="TableNormal">

</xml_diff>

<commit_message>
Fixed some stale slot names.
</commit_message>
<xml_diff>
--- a/Glass/Doc/Development Plan.docx
+++ b/Glass/Doc/Development Plan.docx
@@ -67,7 +67,7 @@
           <w:b/>
           <w:bCs/>
         </w:rPr>
-        <w:t xml:space="preserve">D1 — Coordinators allocate; characters execute. A coordinator selects the specific character </w:t>
+        <w:t xml:space="preserve">D1 — Coordinators allocate. A coordinator selects the specific character </w:t>
       </w:r>
       <w:r>
         <w:rPr>
@@ -83,7 +83,21 @@
           <w:b/>
           <w:bCs/>
         </w:rPr>
-        <w:t xml:space="preserve"> the specific action ("Cleric A casts spell N on character X"). No character-level agents make decisions. This eliminates the nobody-responds / everybody-responds failure modes. The model is fire control, not units with initiative.</w:t>
+        <w:t xml:space="preserve"> the specific action ("Cleric A casts spell N on character X"). No character-level agents make decisions</w:t>
+      </w:r>
+      <w:r>
+        <w:rPr>
+          <w:b/>
+          <w:bCs/>
+        </w:rPr>
+        <w:t>, and it is not clear that we need character-level agents as we do not need agents that just repeat their instructions.</w:t>
+      </w:r>
+      <w:r>
+        <w:rPr>
+          <w:b/>
+          <w:bCs/>
+        </w:rPr>
+        <w:t>. This eliminates the nobody-responds / everybody-responds failure modes. The model is fire control, not units with initiative.</w:t>
       </w:r>
     </w:p>
     <w:p>
@@ -100,35 +114,84 @@
         </w:rPr>
         <w:t>D2 — Perfect information. All environmental sensing arrives via network decode into shared state. Sensors do not delay or distort. A character never knows more than the coordinator. ISXGlass provides no sensing — it is a command sink only.</w:t>
       </w:r>
-    </w:p>
-    <w:p>
-      <w:pPr>
-        <w:rPr>
-          <w:b/>
-          <w:bCs/>
-        </w:rPr>
-      </w:pPr>
-      <w:r>
-        <w:rPr>
-          <w:b/>
-          <w:bCs/>
-        </w:rPr>
-        <w:t>D3 — Direct dispatch. Coordinators issue commands directly to the per-session command pipe. No intermediary component.</w:t>
-      </w:r>
-    </w:p>
-    <w:p>
-      <w:pPr>
-        <w:rPr>
-          <w:b/>
-          <w:bCs/>
-        </w:rPr>
-      </w:pPr>
-      <w:r>
-        <w:rPr>
-          <w:b/>
-          <w:bCs/>
-        </w:rPr>
-        <w:t>D4 — The chat channel is the operator interface, both directions. Inbound: the MA's chat ("assist me on a skeleton", "mez that") is decoded off the wire like any packet and drives coordinator behavior. Outbound: coordinators report status by speaking through a character's session ("Healer needs 30s"). No new operator UI is required for basic automation.</w:t>
+      <w:r>
+        <w:rPr>
+          <w:b/>
+          <w:bCs/>
+        </w:rPr>
+        <w:t xml:space="preserve"> Frankly we should ignore its existence now as it is just a mechanism that is used.</w:t>
+      </w:r>
+    </w:p>
+    <w:p>
+      <w:pPr>
+        <w:rPr>
+          <w:b/>
+          <w:bCs/>
+        </w:rPr>
+      </w:pPr>
+      <w:r>
+        <w:rPr>
+          <w:b/>
+          <w:bCs/>
+        </w:rPr>
+        <w:t>D3 — Direct dispatch. Coordinators issue commands</w:t>
+      </w:r>
+      <w:r>
+        <w:rPr>
+          <w:b/>
+          <w:bCs/>
+        </w:rPr>
+        <w:t xml:space="preserve"> directly to sessions without going through character proxies.</w:t>
+      </w:r>
+    </w:p>
+    <w:p>
+      <w:pPr>
+        <w:rPr>
+          <w:b/>
+          <w:bCs/>
+        </w:rPr>
+      </w:pPr>
+      <w:r>
+        <w:rPr>
+          <w:b/>
+          <w:bCs/>
+        </w:rPr>
+        <w:t xml:space="preserve">D4 — The chat channel </w:t>
+      </w:r>
+      <w:r>
+        <w:rPr>
+          <w:b/>
+          <w:bCs/>
+        </w:rPr>
+        <w:t xml:space="preserve">may be an </w:t>
+      </w:r>
+      <w:r>
+        <w:rPr>
+          <w:b/>
+          <w:bCs/>
+        </w:rPr>
+        <w:t xml:space="preserve">operator interface, </w:t>
+      </w:r>
+      <w:r>
+        <w:rPr>
+          <w:b/>
+          <w:bCs/>
+        </w:rPr>
+        <w:t xml:space="preserve">working in </w:t>
+      </w:r>
+      <w:r>
+        <w:rPr>
+          <w:b/>
+          <w:bCs/>
+        </w:rPr>
+        <w:t>both directions. Inbound: the MA's chat ("assist me on a skeleton", "mez that") is decoded off the wire like any packet and drives coordinator behavior. Outbound: coordinators report status by speaking through a character's session ("Healer needs 30s"). No new operator UI is required for basic automation</w:t>
+      </w:r>
+      <w:r>
+        <w:rPr>
+          <w:b/>
+          <w:bCs/>
+        </w:rPr>
+        <w:t xml:space="preserve"> unless it helps.  We have the ability to creates widgets that run on the bar monitor and respond to touch events.</w:t>
       </w:r>
     </w:p>
     <w:p>
@@ -158,6 +221,7 @@
           <w:b/>
           <w:bCs/>
         </w:rPr>
+        <w:lastRenderedPageBreak/>
         <w:t>D6 — Contingencies are pre-planned. For known failure events (mez break, charm break), the coordinator computes the reaction bundle at fight start — who stuns, who heals, who taunts — and fires it on the event. No fresh decisions under pressure.</w:t>
       </w:r>
     </w:p>
@@ -173,7 +237,6 @@
           <w:b/>
           <w:bCs/>
         </w:rPr>
-        <w:lastRenderedPageBreak/>
         <w:t>D7 — Deferred: multi-coordinator arbitration. When two coordinators address one character (heal vs. move), something must arbitrate. Deliberately unresolved. Trigger to revisit: the second concurrent coordinator comes online — concretely, the mez-break contingency (UC-10), where CC and healing act together.</w:t>
       </w:r>
     </w:p>
@@ -334,7 +397,6 @@
           <w:b/>
           <w:bCs/>
         </w:rPr>
-        <w:lastRenderedPageBreak/>
         <w:t>UC-8 — MA verbal fight direction. "Offtank that", "mez that", "switch targets" — decoded directives translated into allocations. Introduces per-target effect tracking: DOTted targets cannot be mezzed until DOTs fade; damaging a mezzed target is forbidden.</w:t>
       </w:r>
     </w:p>
@@ -503,7 +565,6 @@
         <w:pStyle w:val="Heading1"/>
       </w:pPr>
       <w:r>
-        <w:lastRenderedPageBreak/>
         <w:t>5. Investigations</w:t>
       </w:r>
     </w:p>
@@ -555,6 +616,22 @@
     </w:p>
     <w:p>
       <w:pPr>
+        <w:ind w:left="720"/>
+        <w:rPr>
+          <w:b/>
+          <w:bCs/>
+        </w:rPr>
+      </w:pPr>
+      <w:r>
+        <w:rPr>
+          <w:b/>
+          <w:bCs/>
+        </w:rPr>
+        <w:t>[We have a basic understand of the Aggro data.  We can see values rise, and warn characters before they draw Aggro]</w:t>
+      </w:r>
+    </w:p>
+    <w:p>
+      <w:pPr>
         <w:numPr>
           <w:ilvl w:val="0"/>
           <w:numId w:val="1"/>
@@ -714,6 +791,7 @@
         <w:pStyle w:val="Heading1"/>
       </w:pPr>
       <w:r>
+        <w:lastRenderedPageBreak/>
         <w:t>7. Development Order</w:t>
       </w:r>
     </w:p>
@@ -733,7 +811,7 @@
           <w:b/>
           <w:bCs/>
         </w:rPr>
-        <w:t>P-1: Prove dispatch. One programmatic command from Glass through the session pipe producing an in-game action (a /sit would do). The single riskiest unknown; unblocks everything.</w:t>
+        <w:t>P-2: Demo 2 — UC-1. Healer heals on threshold. HP decode (exists), minimal spell REF.</w:t>
       </w:r>
     </w:p>
     <w:p>
@@ -752,26 +830,6 @@
           <w:b/>
           <w:bCs/>
         </w:rPr>
-        <w:t>P-2: Demo 2 — UC-1. Healer heals on threshold. Requires P-1, HP decode (exists), minimal spell REF.</w:t>
-      </w:r>
-    </w:p>
-    <w:p>
-      <w:pPr>
-        <w:numPr>
-          <w:ilvl w:val="0"/>
-          <w:numId w:val="3"/>
-        </w:numPr>
-        <w:rPr>
-          <w:b/>
-          <w:bCs/>
-        </w:rPr>
-      </w:pPr>
-      <w:r>
-        <w:rPr>
-          <w:b/>
-          <w:bCs/>
-        </w:rPr>
-        <w:lastRenderedPageBreak/>
         <w:t>P-3: Harden the healer. UC-3, UC-4, then UC-2 with the responsibility model.</w:t>
       </w:r>
     </w:p>

</xml_diff>